<commit_message>
feat: address Part 1 feedback and add Part 2 runnable app
Part 1 fixes (professor feedback):
- Add user-assigned managed identity attached to the web app
- Switch Key Vault from access policy to RBAC authorization
- Add RBAC role assignments (storage blob + key vault) for identity and user
- Add scripted bootstrap + azurerm remote state backend
- Split monolithic main.tf into per-resource files
- Expand variables (environment, sku, tags, validation, etc.)
- Upgrade azurerm provider to v4

Part 2 (runnable cloud application):
- Node.js + Express app: list blobs with download links (Web Page 1),
  upload form (Web Page 2), all via DefaultAzureCredential (managed identity)
- Read a sensitive value from Key Vault at runtime
- Deploy scripts (PowerShell/bash) and Azure DevOps build/deploy pipeline
- Rewrite README with approach, resource connections and identity context
</commit_message>
<xml_diff>
--- a/Documentation/Part1-GAA.docx
+++ b/Documentation/Part1-GAA.docx
@@ -445,15 +445,6 @@
     <w:p>
       <w:pPr>
         <w:pStyle w:val="ListParagraph"/>
-        <w:ind w:left="1080"/>
-        <w:rPr>
-          <w:rFonts w:ascii="Times New Roman" w:hAnsi="Times New Roman" w:cs="Times New Roman"/>
-        </w:rPr>
-      </w:pPr>
-    </w:p>
-    <w:p>
-      <w:pPr>
-        <w:pStyle w:val="ListParagraph"/>
         <w:numPr>
           <w:ilvl w:val="0"/>
           <w:numId w:val="4"/>
@@ -467,6 +458,55 @@
         <w:rPr>
           <w:rFonts w:ascii="Times New Roman" w:hAnsi="Times New Roman" w:cs="Times New Roman"/>
         </w:rPr>
+        <w:t xml:space="preserve">Create a file named </w:t>
+      </w:r>
+      <w:proofErr w:type="spellStart"/>
+      <w:proofErr w:type="gramStart"/>
+      <w:r>
+        <w:rPr>
+          <w:rFonts w:ascii="Times New Roman" w:hAnsi="Times New Roman" w:cs="Times New Roman"/>
+        </w:rPr>
+        <w:t>terraform.tfvars</w:t>
+      </w:r>
+      <w:proofErr w:type="spellEnd"/>
+      <w:proofErr w:type="gramEnd"/>
+      <w:r>
+        <w:rPr>
+          <w:rFonts w:ascii="Times New Roman" w:hAnsi="Times New Roman" w:cs="Times New Roman"/>
+        </w:rPr>
+        <w:t xml:space="preserve"> inside the terraform/ folder with the following content: </w:t>
+      </w:r>
+      <w:proofErr w:type="spellStart"/>
+      <w:r>
+        <w:rPr>
+          <w:rFonts w:ascii="Times New Roman" w:hAnsi="Times New Roman" w:cs="Times New Roman"/>
+        </w:rPr>
+        <w:t>subscription_id</w:t>
+      </w:r>
+      <w:proofErr w:type="spellEnd"/>
+      <w:r>
+        <w:rPr>
+          <w:rFonts w:ascii="Times New Roman" w:hAnsi="Times New Roman" w:cs="Times New Roman"/>
+        </w:rPr>
+        <w:t xml:space="preserve"> = "your-id-here". Replace the value with the id obtained from the previous command."</w:t>
+      </w:r>
+    </w:p>
+    <w:p>
+      <w:pPr>
+        <w:pStyle w:val="ListParagraph"/>
+        <w:numPr>
+          <w:ilvl w:val="0"/>
+          <w:numId w:val="4"/>
+        </w:numPr>
+        <w:ind w:left="1080"/>
+        <w:rPr>
+          <w:rFonts w:ascii="Times New Roman" w:hAnsi="Times New Roman" w:cs="Times New Roman"/>
+        </w:rPr>
+      </w:pPr>
+      <w:r>
+        <w:rPr>
+          <w:rFonts w:ascii="Times New Roman" w:hAnsi="Times New Roman" w:cs="Times New Roman"/>
+        </w:rPr>
         <w:t xml:space="preserve">Next, we must create the entire structure of our project using Terraform—specifically, the structure that will </w:t>
       </w:r>
       <w:proofErr w:type="gramStart"/>
@@ -553,6 +593,7 @@
           <w:b/>
           <w:bCs/>
         </w:rPr>
+        <w:lastRenderedPageBreak/>
         <w:t>terraform</w:t>
       </w:r>
       <w:proofErr w:type="gramEnd"/>
@@ -576,14 +617,6 @@
       </w:r>
       <w:proofErr w:type="spellEnd"/>
       <w:proofErr w:type="gramEnd"/>
-    </w:p>
-    <w:p>
-      <w:pPr>
-        <w:ind w:left="360"/>
-        <w:rPr>
-          <w:rFonts w:ascii="Times New Roman" w:hAnsi="Times New Roman" w:cs="Times New Roman"/>
-        </w:rPr>
-      </w:pPr>
     </w:p>
     <w:p>
       <w:pPr>
@@ -601,7 +634,6 @@
         <w:rPr>
           <w:rFonts w:ascii="Times New Roman" w:hAnsi="Times New Roman" w:cs="Times New Roman"/>
         </w:rPr>
-        <w:lastRenderedPageBreak/>
         <w:t xml:space="preserve">The following command </w:t>
       </w:r>
       <w:proofErr w:type="gramStart"/>
@@ -1957,7 +1989,21 @@
         <w:rPr>
           <w:rFonts w:ascii="Times New Roman" w:hAnsi="Times New Roman" w:cs="Times New Roman"/>
         </w:rPr>
-        <w:t>not even the creator. Access is granted by specifying a `</w:t>
+        <w:t xml:space="preserve">not even the creator. Access </w:t>
+      </w:r>
+      <w:proofErr w:type="gramStart"/>
+      <w:r>
+        <w:rPr>
+          <w:rFonts w:ascii="Times New Roman" w:hAnsi="Times New Roman" w:cs="Times New Roman"/>
+        </w:rPr>
+        <w:t>is granted</w:t>
+      </w:r>
+      <w:proofErr w:type="gramEnd"/>
+      <w:r>
+        <w:rPr>
+          <w:rFonts w:ascii="Times New Roman" w:hAnsi="Times New Roman" w:cs="Times New Roman"/>
+        </w:rPr>
+        <w:t xml:space="preserve"> by specifying a `</w:t>
       </w:r>
       <w:proofErr w:type="spellStart"/>
       <w:r>
@@ -1981,6 +2027,7 @@
         <w:t>object_id</w:t>
       </w:r>
       <w:proofErr w:type="spellEnd"/>
+      <w:proofErr w:type="gramStart"/>
       <w:r>
         <w:rPr>
           <w:rFonts w:ascii="Times New Roman" w:hAnsi="Times New Roman" w:cs="Times New Roman"/>
@@ -1991,13 +2038,34 @@
         <w:rPr>
           <w:rFonts w:ascii="Times New Roman" w:hAnsi="Times New Roman" w:cs="Times New Roman"/>
         </w:rPr>
-        <w:t xml:space="preserve">, </w:t>
-      </w:r>
-      <w:r>
-        <w:rPr>
-          <w:rFonts w:ascii="Times New Roman" w:hAnsi="Times New Roman" w:cs="Times New Roman"/>
-        </w:rPr>
-        <w:t>both of which are obtained dynamically using the `</w:t>
+        <w:t>,</w:t>
+      </w:r>
+      <w:proofErr w:type="gramEnd"/>
+      <w:r>
+        <w:rPr>
+          <w:rFonts w:ascii="Times New Roman" w:hAnsi="Times New Roman" w:cs="Times New Roman"/>
+        </w:rPr>
+        <w:t xml:space="preserve"> </w:t>
+      </w:r>
+      <w:r>
+        <w:rPr>
+          <w:rFonts w:ascii="Times New Roman" w:hAnsi="Times New Roman" w:cs="Times New Roman"/>
+        </w:rPr>
+        <w:t xml:space="preserve">both of which </w:t>
+      </w:r>
+      <w:proofErr w:type="gramStart"/>
+      <w:r>
+        <w:rPr>
+          <w:rFonts w:ascii="Times New Roman" w:hAnsi="Times New Roman" w:cs="Times New Roman"/>
+        </w:rPr>
+        <w:t>are obtained</w:t>
+      </w:r>
+      <w:proofErr w:type="gramEnd"/>
+      <w:r>
+        <w:rPr>
+          <w:rFonts w:ascii="Times New Roman" w:hAnsi="Times New Roman" w:cs="Times New Roman"/>
+        </w:rPr>
+        <w:t xml:space="preserve"> dynamically using the `</w:t>
       </w:r>
       <w:proofErr w:type="spellStart"/>
       <w:r>
@@ -2495,7 +2563,7 @@
   <w:abstractNum w:abstractNumId="4" w15:restartNumberingAfterBreak="0">
     <w:nsid w:val="29F312BC"/>
     <w:multiLevelType w:val="hybridMultilevel"/>
-    <w:tmpl w:val="F27C223E"/>
+    <w:tmpl w:val="8A72AA6E"/>
     <w:lvl w:ilvl="0" w:tplc="2228A442">
       <w:start w:val="1"/>
       <w:numFmt w:val="bullet"/>
@@ -2508,7 +2576,7 @@
         <w:rFonts w:ascii="Symbol" w:hAnsi="Symbol" w:hint="default"/>
       </w:rPr>
     </w:lvl>
-    <w:lvl w:ilvl="1" w:tplc="04090003" w:tentative="1">
+    <w:lvl w:ilvl="1" w:tplc="04090003">
       <w:start w:val="1"/>
       <w:numFmt w:val="bullet"/>
       <w:lvlText w:val="o"/>
@@ -2721,7 +2789,7 @@
   <w:abstractNum w:abstractNumId="6" w15:restartNumberingAfterBreak="0">
     <w:nsid w:val="3E0A51A3"/>
     <w:multiLevelType w:val="hybridMultilevel"/>
-    <w:tmpl w:val="B77213D2"/>
+    <w:tmpl w:val="831AE448"/>
     <w:lvl w:ilvl="0" w:tplc="04090001">
       <w:start w:val="1"/>
       <w:numFmt w:val="bullet"/>

</xml_diff>